<commit_message>
Address rubric review: labels, numbers and leakage fixes
- Readable labels on the correlation heatmap and odds-ratio chart; legend
  order matches bars on the violations chart; corrected chart title.
- Print every number quoted in the text (chain rates, max score,
  restaurant count, medians, correlations, top ZIP codes, month odds).
- Outlier caps and the cuisine list now use the training period only.
- Per-fold comparison shows the baseline beats both references in every
  cross-validation fold; explain the higher test-period failure rate.
- Correct small number and wording errors in notebooks, README and the
  Word summary (baseline PR-AUC now 0.355).
</commit_message>
<xml_diff>
--- a/Capstone_20.1_Summary_of_Findings_Vyom_Rawat.docx
+++ b/Capstone_20.1_Summary_of_Findings_Vyom_Rawat.docx
@@ -105,7 +105,7 @@
         </w:rPr>
         <w:t xml:space="preserve">GitHub repository: </w:t>
       </w:r>
-      <w:hyperlink w:history="1" r:id="rIdn0ttdu_fap4og2oyyfyh8">
+      <w:hyperlink w:history="1" r:id="rIdurbz6clydhcxvduj7h-bz">
         <w:r>
           <w:rPr>
             <w:rFonts w:ascii="Cambria" w:cs="Cambria" w:eastAsia="Cambria" w:hAnsi="Cambria"/>
@@ -138,7 +138,7 @@
         </w:rPr>
         <w:t xml:space="preserve">Notebook 1 (cleaning, EDA, features): </w:t>
       </w:r>
-      <w:hyperlink w:history="1" r:id="rIdk_j3qx4f0syxrolscbmno">
+      <w:hyperlink w:history="1" r:id="rIdtwtrqj-qntyz1d2kt9t7g">
         <w:r>
           <w:rPr>
             <w:rFonts w:ascii="Cambria" w:cs="Cambria" w:eastAsia="Cambria" w:hAnsi="Cambria"/>
@@ -171,7 +171,7 @@
         </w:rPr>
         <w:t xml:space="preserve">Notebook 2 (baseline model): </w:t>
       </w:r>
-      <w:hyperlink w:history="1" r:id="rIdz7elloeal1sb4hfe1aoea">
+      <w:hyperlink w:history="1" r:id="rId_xjeiy8jf9u3gvdlvep5r">
         <w:r>
           <w:rPr>
             <w:rFonts w:ascii="Cambria" w:cs="Cambria" w:eastAsia="Cambria" w:hAnsi="Cambria"/>
@@ -265,7 +265,7 @@
         </w:rPr>
         <w:t xml:space="preserve">Source: </w:t>
       </w:r>
-      <w:hyperlink w:history="1" r:id="rIdk5aaosrn1kolet4f7iwjl">
+      <w:hyperlink w:history="1" r:id="rIdowwjmhotgus-ikz0l0avk">
         <w:r>
           <w:rPr>
             <w:rFonts w:ascii="Cambria" w:cs="Cambria" w:eastAsia="Cambria" w:hAnsi="Cambria"/>
@@ -1481,7 +1481,7 @@
                 <w:sz w:val="18"/>
                 <w:szCs w:val="18"/>
               </w:rPr>
-              <w:t xml:space="preserve">0.356</w:t>
+              <w:t xml:space="preserve">0.355</w:t>
             </w:r>
           </w:p>
         </w:tc>
@@ -1608,7 +1608,7 @@
           <w:sz w:val="21"/>
           <w:szCs w:val="21"/>
         </w:rPr>
-        <w:t xml:space="preserve">if inspectors visit the riskiest 10% of restaurants first, 43% of those visits uncover a serious failure, versus 21% at random: about twice the hit rate. Time-ordered cross-validation on the training period gives PR-AUC 0.297 ± 0.046, so the gain is consistent. The strongest risk factors are a poor inspection history, earlier pests and temperature problems, summer months and certain cuisines; larger chains and long clean records lower the risk.</w:t>
+        <w:t xml:space="preserve">if inspectors visit the riskiest 10% of restaurants first, 43% of those visits uncover a serious failure, versus 21% at random: about twice the hit rate. Time-ordered cross-validation on the training period gives PR-AUC 0.297 ± 0.046, and the model beats both reference approaches in every one of the 5 folds, so the gain is consistent. The strongest risk factors are a poor inspection history, earlier pests and temperature problems, summer months and certain cuisines; larger chains and long clean records lower the risk.</w:t>
       </w:r>
     </w:p>
     <w:p>

</xml_diff>